<commit_message>
fix: presisi format nama+gelar SPMT (hilangkan spasi nyangkut)
Template lama hardcode {gelar_depan} <spasi> {nama_lengkap} <spasi>
{gelar_belakang} sbg run terpisah, jadi kalau gelar depan kosong ada
spasi nyangkut di depan nama, dan sebelum koma gelar belakang.
Gabung jadi satu placeholder {nama_lengkap_gelar} yang dihitung via
formatNamaGelar() - handle gelar depan kosong & buang koma dobel dari
data Excel.

Co-Authored-By: Claude Sonnet 5 <noreply@anthropic.com>
Claude-Session: https://claude.ai/code/session_01AKbVyEacy1mJHifnS6rmAB
</commit_message>
<xml_diff>
--- a/templates/SPMT_PPPK_PW.docx
+++ b/templates/SPMT_PPPK_PW.docx
@@ -1386,35 +1386,7 @@
                 <w:rFonts w:cs="Tahoma" w:ascii="Bookman Old Style" w:hAnsi="Bookman Old Style"/>
                 <w:lang w:val="sv-SE"/>
               </w:rPr>
-              <w:t>{gelar_depan}</w:t>
-            </w:r>
-            <w:r>
-              <w:rPr>
-                <w:rFonts w:eastAsia="Bookman Old Style" w:cs="Bookman Old Style" w:ascii="Bookman Old Style" w:hAnsi="Bookman Old Style"/>
-                <w:lang w:val="sv-SE"/>
-              </w:rPr>
-              <w:t xml:space="preserve"> </w:t>
-            </w:r>
-            <w:r>
-              <w:rPr>
-                <w:rFonts w:cs="Tahoma" w:ascii="Bookman Old Style" w:hAnsi="Bookman Old Style"/>
-                <w:lang w:val="sv-SE"/>
-              </w:rPr>
-              <w:t>{nama_lengkap}</w:t>
-            </w:r>
-            <w:r>
-              <w:rPr>
-                <w:rFonts w:eastAsia="Bookman Old Style" w:cs="Bookman Old Style" w:ascii="Bookman Old Style" w:hAnsi="Bookman Old Style"/>
-                <w:lang w:val="sv-SE"/>
-              </w:rPr>
-              <w:t xml:space="preserve"> </w:t>
-            </w:r>
-            <w:r>
-              <w:rPr>
-                <w:rFonts w:cs="Tahoma" w:ascii="Bookman Old Style" w:hAnsi="Bookman Old Style"/>
-                <w:lang w:val="sv-SE"/>
-              </w:rPr>
-              <w:t>{gelar_belakang}</w:t>
+              <w:t>{nama_lengkap_gelar}</w:t>
             </w:r>
           </w:p>
         </w:tc>

</xml_diff>